<commit_message>
Aula 04 e atualizacao plano ensino
</commit_message>
<xml_diff>
--- a/PLANO DE ENSINO.docx
+++ b/PLANO DE ENSINO.docx
@@ -1,6 +1,6 @@
 
 <file path=word/document.xml><?xml version="1.0" encoding="utf-8"?>
-<w:document xmlns:wpc="http://schemas.microsoft.com/office/word/2010/wordprocessingCanvas" xmlns:cx="http://schemas.microsoft.com/office/drawing/2014/chartex" xmlns:cx1="http://schemas.microsoft.com/office/drawing/2015/9/8/chartex" xmlns:cx2="http://schemas.microsoft.com/office/drawing/2015/10/21/chartex" xmlns:cx3="http://schemas.microsoft.com/office/drawing/2016/5/9/chartex" xmlns:cx4="http://schemas.microsoft.com/office/drawing/2016/5/10/chartex" xmlns:cx5="http://schemas.microsoft.com/office/drawing/2016/5/11/chartex" xmlns:cx6="http://schemas.microsoft.com/office/drawing/2016/5/12/chartex" xmlns:cx7="http://schemas.microsoft.com/office/drawing/2016/5/13/chartex" xmlns:cx8="http://schemas.microsoft.com/office/drawing/2016/5/14/chartex" xmlns:mc="http://schemas.openxmlformats.org/markup-compatibility/2006" xmlns:aink="http://schemas.microsoft.com/office/drawing/2016/ink" xmlns:am3d="http://schemas.microsoft.com/office/drawing/2017/model3d" xmlns:o="urn:schemas-microsoft-com:office:office" xmlns:oel="http://schemas.microsoft.com/office/2019/extlst" xmlns:r="http://schemas.openxmlformats.org/officeDocument/2006/relationships" xmlns:m="http://schemas.openxmlformats.org/officeDocument/2006/math" xmlns:v="urn:schemas-microsoft-com:vml" xmlns:wp14="http://schemas.microsoft.com/office/word/2010/wordprocessingDrawing" xmlns:wp="http://schemas.openxmlformats.org/drawingml/2006/wordprocessingDrawing" xmlns:w10="urn:schemas-microsoft-com:office:word" xmlns:w="http://schemas.openxmlformats.org/wordprocessingml/2006/main" xmlns:w14="http://schemas.microsoft.com/office/word/2010/wordml" xmlns:w15="http://schemas.microsoft.com/office/word/2012/wordml" xmlns:w16cex="http://schemas.microsoft.com/office/word/2018/wordml/cex" xmlns:w16cid="http://schemas.microsoft.com/office/word/2016/wordml/cid" xmlns:w16="http://schemas.microsoft.com/office/word/2018/wordml" xmlns:w16sdtdh="http://schemas.microsoft.com/office/word/2020/wordml/sdtdatahash" xmlns:w16se="http://schemas.microsoft.com/office/word/2015/wordml/symex" xmlns:wpg="http://schemas.microsoft.com/office/word/2010/wordprocessingGroup" xmlns:wpi="http://schemas.microsoft.com/office/word/2010/wordprocessingInk" xmlns:wne="http://schemas.microsoft.com/office/word/2006/wordml" xmlns:wps="http://schemas.microsoft.com/office/word/2010/wordprocessingShape" mc:Ignorable="w14 w15 w16se w16cid w16 w16cex w16sdtdh wp14">
+<w:document xmlns:wpc="http://schemas.microsoft.com/office/word/2010/wordprocessingCanvas" xmlns:cx="http://schemas.microsoft.com/office/drawing/2014/chartex" xmlns:cx1="http://schemas.microsoft.com/office/drawing/2015/9/8/chartex" xmlns:cx2="http://schemas.microsoft.com/office/drawing/2015/10/21/chartex" xmlns:cx3="http://schemas.microsoft.com/office/drawing/2016/5/9/chartex" xmlns:cx4="http://schemas.microsoft.com/office/drawing/2016/5/10/chartex" xmlns:cx5="http://schemas.microsoft.com/office/drawing/2016/5/11/chartex" xmlns:cx6="http://schemas.microsoft.com/office/drawing/2016/5/12/chartex" xmlns:cx7="http://schemas.microsoft.com/office/drawing/2016/5/13/chartex" xmlns:cx8="http://schemas.microsoft.com/office/drawing/2016/5/14/chartex" xmlns:mc="http://schemas.openxmlformats.org/markup-compatibility/2006" xmlns:aink="http://schemas.microsoft.com/office/drawing/2016/ink" xmlns:am3d="http://schemas.microsoft.com/office/drawing/2017/model3d" xmlns:o="urn:schemas-microsoft-com:office:office" xmlns:oel="http://schemas.microsoft.com/office/2019/extlst" xmlns:r="http://schemas.openxmlformats.org/officeDocument/2006/relationships" xmlns:m="http://schemas.openxmlformats.org/officeDocument/2006/math" xmlns:v="urn:schemas-microsoft-com:vml" xmlns:wp14="http://schemas.microsoft.com/office/word/2010/wordprocessingDrawing" xmlns:wp="http://schemas.openxmlformats.org/drawingml/2006/wordprocessingDrawing" xmlns:w10="urn:schemas-microsoft-com:office:word" xmlns:w="http://schemas.openxmlformats.org/wordprocessingml/2006/main" xmlns:w14="http://schemas.microsoft.com/office/word/2010/wordml" xmlns:w15="http://schemas.microsoft.com/office/word/2012/wordml" xmlns:w16cex="http://schemas.microsoft.com/office/word/2018/wordml/cex" xmlns:w16cid="http://schemas.microsoft.com/office/word/2016/wordml/cid" xmlns:w16="http://schemas.microsoft.com/office/word/2018/wordml" xmlns:w16du="http://schemas.microsoft.com/office/word/2023/wordml/word16du" xmlns:w16sdtdh="http://schemas.microsoft.com/office/word/2020/wordml/sdtdatahash" xmlns:w16sdtfl="http://schemas.microsoft.com/office/word/2024/wordml/sdtformatlock" xmlns:w16se="http://schemas.microsoft.com/office/word/2015/wordml/symex" xmlns:wpg="http://schemas.microsoft.com/office/word/2010/wordprocessingGroup" xmlns:wpi="http://schemas.microsoft.com/office/word/2010/wordprocessingInk" xmlns:wne="http://schemas.microsoft.com/office/word/2006/wordml" xmlns:wps="http://schemas.microsoft.com/office/word/2010/wordprocessingShape" mc:Ignorable="w14 w15 w16se w16cid w16 w16cex w16sdtdh w16sdtfl w16du wp14">
   <w:body>
     <w:p>
       <w:pPr>
@@ -151,19 +151,7 @@
         <w:rPr>
           <w:rFonts w:ascii="Arial" w:eastAsia="Arial" w:hAnsi="Arial" w:cs="Arial"/>
         </w:rPr>
-        <w:t xml:space="preserve">; </w:t>
-      </w:r>
-      <w:r>
-        <w:rPr>
-          <w:rFonts w:ascii="Arial" w:eastAsia="Arial" w:hAnsi="Arial" w:cs="Arial"/>
-        </w:rPr>
-        <w:t>Webservices</w:t>
-      </w:r>
-      <w:r>
-        <w:rPr>
-          <w:rFonts w:ascii="Arial" w:eastAsia="Arial" w:hAnsi="Arial" w:cs="Arial"/>
-        </w:rPr>
-        <w:t>.</w:t>
+        <w:t>; Webservices.</w:t>
       </w:r>
     </w:p>
     <w:p>
@@ -551,21 +539,7 @@
           <w:rFonts w:ascii="Arial" w:eastAsia="Arial" w:hAnsi="Arial" w:cs="Arial"/>
         </w:rPr>
         <w:lastRenderedPageBreak/>
-        <w:t xml:space="preserve">CÂMARA, Gilberto; DAVIS, </w:t>
-      </w:r>
-      <w:proofErr w:type="spellStart"/>
-      <w:r>
-        <w:rPr>
-          <w:rFonts w:ascii="Arial" w:eastAsia="Arial" w:hAnsi="Arial" w:cs="Arial"/>
-        </w:rPr>
-        <w:t>Clodoveu</w:t>
-      </w:r>
-      <w:proofErr w:type="spellEnd"/>
-      <w:r>
-        <w:rPr>
-          <w:rFonts w:ascii="Arial" w:eastAsia="Arial" w:hAnsi="Arial" w:cs="Arial"/>
-        </w:rPr>
-        <w:t>; MONTEIRO, Antônio Miguel Vieira.</w:t>
+        <w:t>CÂMARA, Gilberto; DAVIS, Clodoveu; MONTEIRO, Antônio Miguel Vieira.</w:t>
       </w:r>
       <w:r>
         <w:rPr>
@@ -577,21 +551,7 @@
         <w:rPr>
           <w:rFonts w:ascii="Arial" w:eastAsia="Arial" w:hAnsi="Arial" w:cs="Arial"/>
         </w:rPr>
-        <w:t xml:space="preserve">Introdução à ciência da </w:t>
-      </w:r>
-      <w:proofErr w:type="spellStart"/>
-      <w:r>
-        <w:rPr>
-          <w:rFonts w:ascii="Arial" w:eastAsia="Arial" w:hAnsi="Arial" w:cs="Arial"/>
-        </w:rPr>
-        <w:t>geoinformação</w:t>
-      </w:r>
-      <w:proofErr w:type="spellEnd"/>
-      <w:r>
-        <w:rPr>
-          <w:rFonts w:ascii="Arial" w:eastAsia="Arial" w:hAnsi="Arial" w:cs="Arial"/>
-        </w:rPr>
-        <w:t>. 2001.</w:t>
+        <w:t>Introdução à ciência da geoinformação. 2001.</w:t>
       </w:r>
     </w:p>
     <w:p>
@@ -761,19 +721,19 @@
         <w:rPr>
           <w:rFonts w:ascii="Arial" w:eastAsia="Arial" w:hAnsi="Arial" w:cs="Arial"/>
         </w:rPr>
-        <w:t>XX</w:t>
-      </w:r>
-      <w:r>
-        <w:rPr>
-          <w:rFonts w:ascii="Arial" w:eastAsia="Arial" w:hAnsi="Arial" w:cs="Arial"/>
-        </w:rPr>
-        <w:t>/</w:t>
-      </w:r>
-      <w:r>
-        <w:rPr>
-          <w:rFonts w:ascii="Arial" w:eastAsia="Arial" w:hAnsi="Arial" w:cs="Arial"/>
-        </w:rPr>
-        <w:t>01</w:t>
+        <w:t>25</w:t>
+      </w:r>
+      <w:r>
+        <w:rPr>
+          <w:rFonts w:ascii="Arial" w:eastAsia="Arial" w:hAnsi="Arial" w:cs="Arial"/>
+        </w:rPr>
+        <w:t>/0</w:t>
+      </w:r>
+      <w:r>
+        <w:rPr>
+          <w:rFonts w:ascii="Arial" w:eastAsia="Arial" w:hAnsi="Arial" w:cs="Arial"/>
+        </w:rPr>
+        <w:t>2</w:t>
       </w:r>
       <w:r>
         <w:rPr>
@@ -785,25 +745,7 @@
         <w:rPr>
           <w:rFonts w:ascii="Arial" w:eastAsia="Arial" w:hAnsi="Arial" w:cs="Arial"/>
         </w:rPr>
-        <w:t>5</w:t>
-      </w:r>
-      <w:r>
-        <w:rPr>
-          <w:rFonts w:ascii="Arial" w:eastAsia="Arial" w:hAnsi="Arial" w:cs="Arial"/>
-        </w:rPr>
-        <w:t xml:space="preserve"> – Aula 1: Introdução ao SIG ao QGIS (</w:t>
-      </w:r>
-      <w:r>
-        <w:rPr>
-          <w:rFonts w:ascii="Arial" w:eastAsia="Arial" w:hAnsi="Arial" w:cs="Arial"/>
-        </w:rPr>
-        <w:t>2</w:t>
-      </w:r>
-      <w:r>
-        <w:rPr>
-          <w:rFonts w:ascii="Arial" w:eastAsia="Arial" w:hAnsi="Arial" w:cs="Arial"/>
-        </w:rPr>
-        <w:t>h)</w:t>
+        <w:t>5 – Aula 1: Introdução ao SIG ao QGIS (2h)</w:t>
       </w:r>
     </w:p>
     <w:p>
@@ -828,13 +770,19 @@
         <w:rPr>
           <w:rFonts w:ascii="Arial" w:eastAsia="Arial" w:hAnsi="Arial" w:cs="Arial"/>
         </w:rPr>
-        <w:t>XX/0</w:t>
-      </w:r>
-      <w:r>
-        <w:rPr>
-          <w:rFonts w:ascii="Arial" w:eastAsia="Arial" w:hAnsi="Arial" w:cs="Arial"/>
-        </w:rPr>
-        <w:t>2</w:t>
+        <w:t>18</w:t>
+      </w:r>
+      <w:r>
+        <w:rPr>
+          <w:rFonts w:ascii="Arial" w:eastAsia="Arial" w:hAnsi="Arial" w:cs="Arial"/>
+        </w:rPr>
+        <w:t>/0</w:t>
+      </w:r>
+      <w:r>
+        <w:rPr>
+          <w:rFonts w:ascii="Arial" w:eastAsia="Arial" w:hAnsi="Arial" w:cs="Arial"/>
+        </w:rPr>
+        <w:t>3</w:t>
       </w:r>
       <w:r>
         <w:rPr>
@@ -846,43 +794,7 @@
         <w:rPr>
           <w:rFonts w:ascii="Arial" w:eastAsia="Arial" w:hAnsi="Arial" w:cs="Arial"/>
         </w:rPr>
-        <w:t xml:space="preserve">5 – Aula </w:t>
-      </w:r>
-      <w:r>
-        <w:rPr>
-          <w:rFonts w:ascii="Arial" w:eastAsia="Arial" w:hAnsi="Arial" w:cs="Arial"/>
-        </w:rPr>
-        <w:t>2</w:t>
-      </w:r>
-      <w:r>
-        <w:rPr>
-          <w:rFonts w:ascii="Arial" w:eastAsia="Arial" w:hAnsi="Arial" w:cs="Arial"/>
-        </w:rPr>
-        <w:t xml:space="preserve">: </w:t>
-      </w:r>
-      <w:r>
-        <w:rPr>
-          <w:rFonts w:ascii="Arial" w:eastAsia="Arial" w:hAnsi="Arial" w:cs="Arial"/>
-        </w:rPr>
-        <w:t>A</w:t>
-      </w:r>
-      <w:r>
-        <w:rPr>
-          <w:rFonts w:ascii="Arial" w:eastAsia="Arial" w:hAnsi="Arial" w:cs="Arial"/>
-        </w:rPr>
-        <w:t>presentação ao QGIS (</w:t>
-      </w:r>
-      <w:r>
-        <w:rPr>
-          <w:rFonts w:ascii="Arial" w:eastAsia="Arial" w:hAnsi="Arial" w:cs="Arial"/>
-        </w:rPr>
-        <w:t>2</w:t>
-      </w:r>
-      <w:r>
-        <w:rPr>
-          <w:rFonts w:ascii="Arial" w:eastAsia="Arial" w:hAnsi="Arial" w:cs="Arial"/>
-        </w:rPr>
-        <w:t>h)</w:t>
+        <w:t>5 – Aula 2: Apresentação ao QGIS (2h)</w:t>
       </w:r>
     </w:p>
     <w:p>
@@ -907,7 +819,7 @@
         <w:rPr>
           <w:rFonts w:ascii="Arial" w:eastAsia="Arial" w:hAnsi="Arial" w:cs="Arial"/>
         </w:rPr>
-        <w:t>XX</w:t>
+        <w:t>15</w:t>
       </w:r>
       <w:r>
         <w:rPr>
@@ -919,7 +831,13 @@
         <w:rPr>
           <w:rFonts w:ascii="Arial" w:eastAsia="Arial" w:hAnsi="Arial" w:cs="Arial"/>
         </w:rPr>
-        <w:t>03</w:t>
+        <w:t>0</w:t>
+      </w:r>
+      <w:r>
+        <w:rPr>
+          <w:rFonts w:ascii="Arial" w:eastAsia="Arial" w:hAnsi="Arial" w:cs="Arial"/>
+        </w:rPr>
+        <w:t>4</w:t>
       </w:r>
       <w:r>
         <w:rPr>
@@ -931,43 +849,19 @@
         <w:rPr>
           <w:rFonts w:ascii="Arial" w:eastAsia="Arial" w:hAnsi="Arial" w:cs="Arial"/>
         </w:rPr>
-        <w:t>5</w:t>
-      </w:r>
-      <w:r>
-        <w:rPr>
-          <w:rFonts w:ascii="Arial" w:eastAsia="Arial" w:hAnsi="Arial" w:cs="Arial"/>
-        </w:rPr>
-        <w:t xml:space="preserve"> – Aula </w:t>
-      </w:r>
-      <w:r>
-        <w:rPr>
-          <w:rFonts w:ascii="Arial" w:eastAsia="Arial" w:hAnsi="Arial" w:cs="Arial"/>
-        </w:rPr>
-        <w:t>3</w:t>
-      </w:r>
-      <w:r>
-        <w:rPr>
-          <w:rFonts w:ascii="Arial" w:eastAsia="Arial" w:hAnsi="Arial" w:cs="Arial"/>
-        </w:rPr>
-        <w:t xml:space="preserve">: Dados </w:t>
-      </w:r>
-      <w:r>
-        <w:rPr>
-          <w:rFonts w:ascii="Arial" w:eastAsia="Arial" w:hAnsi="Arial" w:cs="Arial"/>
-        </w:rPr>
-        <w:t xml:space="preserve">alfanuméricos, </w:t>
-      </w:r>
-      <w:r>
-        <w:rPr>
-          <w:rFonts w:ascii="Arial" w:eastAsia="Arial" w:hAnsi="Arial" w:cs="Arial"/>
-        </w:rPr>
-        <w:t>vetoriais</w:t>
-      </w:r>
-      <w:r>
-        <w:rPr>
-          <w:rFonts w:ascii="Arial" w:eastAsia="Arial" w:hAnsi="Arial" w:cs="Arial"/>
-        </w:rPr>
-        <w:t xml:space="preserve"> e matriciais (2h)</w:t>
+        <w:t>5 – Aula 3: Dados alfanuméricos</w:t>
+      </w:r>
+      <w:r>
+        <w:rPr>
+          <w:rFonts w:ascii="Arial" w:eastAsia="Arial" w:hAnsi="Arial" w:cs="Arial"/>
+        </w:rPr>
+        <w:t xml:space="preserve"> e</w:t>
+      </w:r>
+      <w:r>
+        <w:rPr>
+          <w:rFonts w:ascii="Arial" w:eastAsia="Arial" w:hAnsi="Arial" w:cs="Arial"/>
+        </w:rPr>
+        <w:t xml:space="preserve"> vetoriais</w:t>
       </w:r>
     </w:p>
     <w:p>
@@ -992,7 +886,37 @@
         <w:rPr>
           <w:rFonts w:ascii="Arial" w:eastAsia="Arial" w:hAnsi="Arial" w:cs="Arial"/>
         </w:rPr>
-        <w:t>XX/04/2025 – Aula 4: Compositor de impressão (2h)</w:t>
+        <w:t>20</w:t>
+      </w:r>
+      <w:r>
+        <w:rPr>
+          <w:rFonts w:ascii="Arial" w:eastAsia="Arial" w:hAnsi="Arial" w:cs="Arial"/>
+        </w:rPr>
+        <w:t>/0</w:t>
+      </w:r>
+      <w:r>
+        <w:rPr>
+          <w:rFonts w:ascii="Arial" w:eastAsia="Arial" w:hAnsi="Arial" w:cs="Arial"/>
+        </w:rPr>
+        <w:t>5</w:t>
+      </w:r>
+      <w:r>
+        <w:rPr>
+          <w:rFonts w:ascii="Arial" w:eastAsia="Arial" w:hAnsi="Arial" w:cs="Arial"/>
+        </w:rPr>
+        <w:t xml:space="preserve">/2025 – Aula 4: </w:t>
+      </w:r>
+      <w:r>
+        <w:rPr>
+          <w:rFonts w:ascii="Arial" w:eastAsia="Arial" w:hAnsi="Arial" w:cs="Arial"/>
+        </w:rPr>
+        <w:t xml:space="preserve">Dados matriciais e </w:t>
+      </w:r>
+      <w:r>
+        <w:rPr>
+          <w:rFonts w:ascii="Arial" w:eastAsia="Arial" w:hAnsi="Arial" w:cs="Arial"/>
+        </w:rPr>
+        <w:t>Compositor de impressão (2h)</w:t>
       </w:r>
     </w:p>
     <w:p>
@@ -1023,37 +947,13 @@
         <w:rPr>
           <w:rFonts w:ascii="Arial" w:eastAsia="Arial" w:hAnsi="Arial" w:cs="Arial"/>
         </w:rPr>
-        <w:t>5</w:t>
-      </w:r>
-      <w:r>
-        <w:rPr>
-          <w:rFonts w:ascii="Arial" w:eastAsia="Arial" w:hAnsi="Arial" w:cs="Arial"/>
-        </w:rPr>
-        <w:t xml:space="preserve">/2025 – Aula </w:t>
-      </w:r>
-      <w:r>
-        <w:rPr>
-          <w:rFonts w:ascii="Arial" w:eastAsia="Arial" w:hAnsi="Arial" w:cs="Arial"/>
-        </w:rPr>
-        <w:t>5</w:t>
-      </w:r>
-      <w:r>
-        <w:rPr>
-          <w:rFonts w:ascii="Arial" w:eastAsia="Arial" w:hAnsi="Arial" w:cs="Arial"/>
-        </w:rPr>
-        <w:t>: Prática</w:t>
-      </w:r>
-      <w:r>
-        <w:rPr>
-          <w:rFonts w:ascii="Arial" w:eastAsia="Arial" w:hAnsi="Arial" w:cs="Arial"/>
-        </w:rPr>
-        <w:t>s</w:t>
-      </w:r>
-      <w:r>
-        <w:rPr>
-          <w:rFonts w:ascii="Arial" w:eastAsia="Arial" w:hAnsi="Arial" w:cs="Arial"/>
-        </w:rPr>
-        <w:t xml:space="preserve"> de geoprocessamento (2h)</w:t>
+        <w:t>6</w:t>
+      </w:r>
+      <w:r>
+        <w:rPr>
+          <w:rFonts w:ascii="Arial" w:eastAsia="Arial" w:hAnsi="Arial" w:cs="Arial"/>
+        </w:rPr>
+        <w:t>/2025 – Aula 5: Práticas de geoprocessamento (2h)</w:t>
       </w:r>
     </w:p>
     <w:p>
@@ -1081,37 +981,13 @@
         <w:rPr>
           <w:rFonts w:ascii="Arial" w:eastAsia="Arial" w:hAnsi="Arial" w:cs="Arial"/>
         </w:rPr>
-        <w:t>6</w:t>
-      </w:r>
-      <w:r>
-        <w:rPr>
-          <w:rFonts w:ascii="Arial" w:eastAsia="Arial" w:hAnsi="Arial" w:cs="Arial"/>
-        </w:rPr>
-        <w:t xml:space="preserve">/2025 – Aula </w:t>
-      </w:r>
-      <w:r>
-        <w:rPr>
-          <w:rFonts w:ascii="Arial" w:eastAsia="Arial" w:hAnsi="Arial" w:cs="Arial"/>
-        </w:rPr>
-        <w:t>6</w:t>
-      </w:r>
-      <w:r>
-        <w:rPr>
-          <w:rFonts w:ascii="Arial" w:eastAsia="Arial" w:hAnsi="Arial" w:cs="Arial"/>
-        </w:rPr>
-        <w:t xml:space="preserve">: </w:t>
-      </w:r>
-      <w:r>
-        <w:rPr>
-          <w:rFonts w:ascii="Arial" w:eastAsia="Arial" w:hAnsi="Arial" w:cs="Arial"/>
-        </w:rPr>
-        <w:t>Início do projeto</w:t>
-      </w:r>
-      <w:r>
-        <w:rPr>
-          <w:rFonts w:ascii="Arial" w:eastAsia="Arial" w:hAnsi="Arial" w:cs="Arial"/>
-        </w:rPr>
-        <w:t xml:space="preserve"> (2h)</w:t>
+        <w:t>7</w:t>
+      </w:r>
+      <w:r>
+        <w:rPr>
+          <w:rFonts w:ascii="Arial" w:eastAsia="Arial" w:hAnsi="Arial" w:cs="Arial"/>
+        </w:rPr>
+        <w:t>/2025 – Aula 6: Início do projeto (2h)</w:t>
       </w:r>
     </w:p>
     <w:p>
@@ -1139,37 +1015,13 @@
         <w:rPr>
           <w:rFonts w:ascii="Arial" w:eastAsia="Arial" w:hAnsi="Arial" w:cs="Arial"/>
         </w:rPr>
-        <w:t>7</w:t>
-      </w:r>
-      <w:r>
-        <w:rPr>
-          <w:rFonts w:ascii="Arial" w:eastAsia="Arial" w:hAnsi="Arial" w:cs="Arial"/>
-        </w:rPr>
-        <w:t xml:space="preserve">/2025 – Aula </w:t>
-      </w:r>
-      <w:r>
-        <w:rPr>
-          <w:rFonts w:ascii="Arial" w:eastAsia="Arial" w:hAnsi="Arial" w:cs="Arial"/>
-        </w:rPr>
-        <w:t>7</w:t>
-      </w:r>
-      <w:r>
-        <w:rPr>
-          <w:rFonts w:ascii="Arial" w:eastAsia="Arial" w:hAnsi="Arial" w:cs="Arial"/>
-        </w:rPr>
-        <w:t xml:space="preserve">: </w:t>
-      </w:r>
-      <w:r>
-        <w:rPr>
-          <w:rFonts w:ascii="Arial" w:eastAsia="Arial" w:hAnsi="Arial" w:cs="Arial"/>
-        </w:rPr>
-        <w:t>Acompanhamento</w:t>
-      </w:r>
-      <w:r>
-        <w:rPr>
-          <w:rFonts w:ascii="Arial" w:eastAsia="Arial" w:hAnsi="Arial" w:cs="Arial"/>
-        </w:rPr>
-        <w:t xml:space="preserve"> (2h)</w:t>
+        <w:t>8</w:t>
+      </w:r>
+      <w:r>
+        <w:rPr>
+          <w:rFonts w:ascii="Arial" w:eastAsia="Arial" w:hAnsi="Arial" w:cs="Arial"/>
+        </w:rPr>
+        <w:t>/2025 – Aula 7: Acompanhamento (2h)</w:t>
       </w:r>
     </w:p>
     <w:p>
@@ -1197,25 +1049,13 @@
         <w:rPr>
           <w:rFonts w:ascii="Arial" w:eastAsia="Arial" w:hAnsi="Arial" w:cs="Arial"/>
         </w:rPr>
-        <w:t>8</w:t>
-      </w:r>
-      <w:r>
-        <w:rPr>
-          <w:rFonts w:ascii="Arial" w:eastAsia="Arial" w:hAnsi="Arial" w:cs="Arial"/>
-        </w:rPr>
-        <w:t xml:space="preserve">/2025 – Aula </w:t>
-      </w:r>
-      <w:r>
-        <w:rPr>
-          <w:rFonts w:ascii="Arial" w:eastAsia="Arial" w:hAnsi="Arial" w:cs="Arial"/>
-        </w:rPr>
-        <w:t>8</w:t>
-      </w:r>
-      <w:r>
-        <w:rPr>
-          <w:rFonts w:ascii="Arial" w:eastAsia="Arial" w:hAnsi="Arial" w:cs="Arial"/>
-        </w:rPr>
-        <w:t>: Acompanhamento (2h)</w:t>
+        <w:t>9</w:t>
+      </w:r>
+      <w:r>
+        <w:rPr>
+          <w:rFonts w:ascii="Arial" w:eastAsia="Arial" w:hAnsi="Arial" w:cs="Arial"/>
+        </w:rPr>
+        <w:t>/2025 – Aula 8: Acompanhamento (2h)</w:t>
       </w:r>
     </w:p>
     <w:p>
@@ -1237,31 +1077,19 @@
         <w:rPr>
           <w:rFonts w:ascii="Arial" w:eastAsia="Arial" w:hAnsi="Arial" w:cs="Arial"/>
         </w:rPr>
-        <w:t>XX/0</w:t>
-      </w:r>
-      <w:r>
-        <w:rPr>
-          <w:rFonts w:ascii="Arial" w:eastAsia="Arial" w:hAnsi="Arial" w:cs="Arial"/>
-        </w:rPr>
-        <w:t>9</w:t>
-      </w:r>
-      <w:r>
-        <w:rPr>
-          <w:rFonts w:ascii="Arial" w:eastAsia="Arial" w:hAnsi="Arial" w:cs="Arial"/>
-        </w:rPr>
-        <w:t xml:space="preserve">/2025 – Aula </w:t>
-      </w:r>
-      <w:r>
-        <w:rPr>
-          <w:rFonts w:ascii="Arial" w:eastAsia="Arial" w:hAnsi="Arial" w:cs="Arial"/>
-        </w:rPr>
-        <w:t>9</w:t>
-      </w:r>
-      <w:r>
-        <w:rPr>
-          <w:rFonts w:ascii="Arial" w:eastAsia="Arial" w:hAnsi="Arial" w:cs="Arial"/>
-        </w:rPr>
-        <w:t>: Acompanhamento (2h)</w:t>
+        <w:t>XX/</w:t>
+      </w:r>
+      <w:r>
+        <w:rPr>
+          <w:rFonts w:ascii="Arial" w:eastAsia="Arial" w:hAnsi="Arial" w:cs="Arial"/>
+        </w:rPr>
+        <w:t>10</w:t>
+      </w:r>
+      <w:r>
+        <w:rPr>
+          <w:rFonts w:ascii="Arial" w:eastAsia="Arial" w:hAnsi="Arial" w:cs="Arial"/>
+        </w:rPr>
+        <w:t>/2025 – Aula 9: Acompanhamento (2h)</w:t>
       </w:r>
     </w:p>
     <w:p>
@@ -1283,7 +1111,19 @@
         <w:rPr>
           <w:rFonts w:ascii="Arial" w:eastAsia="Arial" w:hAnsi="Arial" w:cs="Arial"/>
         </w:rPr>
-        <w:t>XX/</w:t>
+        <w:t>XX/1</w:t>
+      </w:r>
+      <w:r>
+        <w:rPr>
+          <w:rFonts w:ascii="Arial" w:eastAsia="Arial" w:hAnsi="Arial" w:cs="Arial"/>
+        </w:rPr>
+        <w:t>1</w:t>
+      </w:r>
+      <w:r>
+        <w:rPr>
+          <w:rFonts w:ascii="Arial" w:eastAsia="Arial" w:hAnsi="Arial" w:cs="Arial"/>
+        </w:rPr>
+        <w:t xml:space="preserve">/2025 – Aula </w:t>
       </w:r>
       <w:r>
         <w:rPr>
@@ -1295,19 +1135,7 @@
         <w:rPr>
           <w:rFonts w:ascii="Arial" w:eastAsia="Arial" w:hAnsi="Arial" w:cs="Arial"/>
         </w:rPr>
-        <w:t xml:space="preserve">/2025 – Aula 6: </w:t>
-      </w:r>
-      <w:r>
-        <w:rPr>
-          <w:rFonts w:ascii="Arial" w:eastAsia="Arial" w:hAnsi="Arial" w:cs="Arial"/>
-        </w:rPr>
-        <w:t>Entrega do projeto</w:t>
-      </w:r>
-      <w:r>
-        <w:rPr>
-          <w:rFonts w:ascii="Arial" w:eastAsia="Arial" w:hAnsi="Arial" w:cs="Arial"/>
-        </w:rPr>
-        <w:t xml:space="preserve"> (2h)</w:t>
+        <w:t>: Entrega do projeto (2h)</w:t>
       </w:r>
     </w:p>
     <w:sectPr>
@@ -1321,7 +1149,7 @@
 </file>
 
 <file path=word/numbering.xml><?xml version="1.0" encoding="utf-8"?>
-<w:numbering xmlns:wpc="http://schemas.microsoft.com/office/word/2010/wordprocessingCanvas" xmlns:cx="http://schemas.microsoft.com/office/drawing/2014/chartex" xmlns:cx1="http://schemas.microsoft.com/office/drawing/2015/9/8/chartex" xmlns:cx2="http://schemas.microsoft.com/office/drawing/2015/10/21/chartex" xmlns:cx3="http://schemas.microsoft.com/office/drawing/2016/5/9/chartex" xmlns:cx4="http://schemas.microsoft.com/office/drawing/2016/5/10/chartex" xmlns:cx5="http://schemas.microsoft.com/office/drawing/2016/5/11/chartex" xmlns:cx6="http://schemas.microsoft.com/office/drawing/2016/5/12/chartex" xmlns:cx7="http://schemas.microsoft.com/office/drawing/2016/5/13/chartex" xmlns:cx8="http://schemas.microsoft.com/office/drawing/2016/5/14/chartex" xmlns:mc="http://schemas.openxmlformats.org/markup-compatibility/2006" xmlns:aink="http://schemas.microsoft.com/office/drawing/2016/ink" xmlns:am3d="http://schemas.microsoft.com/office/drawing/2017/model3d" xmlns:o="urn:schemas-microsoft-com:office:office" xmlns:oel="http://schemas.microsoft.com/office/2019/extlst" xmlns:r="http://schemas.openxmlformats.org/officeDocument/2006/relationships" xmlns:m="http://schemas.openxmlformats.org/officeDocument/2006/math" xmlns:v="urn:schemas-microsoft-com:vml" xmlns:wp14="http://schemas.microsoft.com/office/word/2010/wordprocessingDrawing" xmlns:wp="http://schemas.openxmlformats.org/drawingml/2006/wordprocessingDrawing" xmlns:w10="urn:schemas-microsoft-com:office:word" xmlns:w="http://schemas.openxmlformats.org/wordprocessingml/2006/main" xmlns:w14="http://schemas.microsoft.com/office/word/2010/wordml" xmlns:w15="http://schemas.microsoft.com/office/word/2012/wordml" xmlns:w16cex="http://schemas.microsoft.com/office/word/2018/wordml/cex" xmlns:w16cid="http://schemas.microsoft.com/office/word/2016/wordml/cid" xmlns:w16="http://schemas.microsoft.com/office/word/2018/wordml" xmlns:w16sdtdh="http://schemas.microsoft.com/office/word/2020/wordml/sdtdatahash" xmlns:w16se="http://schemas.microsoft.com/office/word/2015/wordml/symex" xmlns:wpg="http://schemas.microsoft.com/office/word/2010/wordprocessingGroup" xmlns:wpi="http://schemas.microsoft.com/office/word/2010/wordprocessingInk" xmlns:wne="http://schemas.microsoft.com/office/word/2006/wordml" xmlns:wps="http://schemas.microsoft.com/office/word/2010/wordprocessingShape" mc:Ignorable="w14 w15 w16se w16cid w16 w16cex w16sdtdh wp14">
+<w:numbering xmlns:wpc="http://schemas.microsoft.com/office/word/2010/wordprocessingCanvas" xmlns:cx="http://schemas.microsoft.com/office/drawing/2014/chartex" xmlns:cx1="http://schemas.microsoft.com/office/drawing/2015/9/8/chartex" xmlns:cx2="http://schemas.microsoft.com/office/drawing/2015/10/21/chartex" xmlns:cx3="http://schemas.microsoft.com/office/drawing/2016/5/9/chartex" xmlns:cx4="http://schemas.microsoft.com/office/drawing/2016/5/10/chartex" xmlns:cx5="http://schemas.microsoft.com/office/drawing/2016/5/11/chartex" xmlns:cx6="http://schemas.microsoft.com/office/drawing/2016/5/12/chartex" xmlns:cx7="http://schemas.microsoft.com/office/drawing/2016/5/13/chartex" xmlns:cx8="http://schemas.microsoft.com/office/drawing/2016/5/14/chartex" xmlns:mc="http://schemas.openxmlformats.org/markup-compatibility/2006" xmlns:aink="http://schemas.microsoft.com/office/drawing/2016/ink" xmlns:am3d="http://schemas.microsoft.com/office/drawing/2017/model3d" xmlns:o="urn:schemas-microsoft-com:office:office" xmlns:oel="http://schemas.microsoft.com/office/2019/extlst" xmlns:r="http://schemas.openxmlformats.org/officeDocument/2006/relationships" xmlns:m="http://schemas.openxmlformats.org/officeDocument/2006/math" xmlns:v="urn:schemas-microsoft-com:vml" xmlns:wp14="http://schemas.microsoft.com/office/word/2010/wordprocessingDrawing" xmlns:wp="http://schemas.openxmlformats.org/drawingml/2006/wordprocessingDrawing" xmlns:w10="urn:schemas-microsoft-com:office:word" xmlns:w="http://schemas.openxmlformats.org/wordprocessingml/2006/main" xmlns:w14="http://schemas.microsoft.com/office/word/2010/wordml" xmlns:w15="http://schemas.microsoft.com/office/word/2012/wordml" xmlns:w16cex="http://schemas.microsoft.com/office/word/2018/wordml/cex" xmlns:w16cid="http://schemas.microsoft.com/office/word/2016/wordml/cid" xmlns:w16="http://schemas.microsoft.com/office/word/2018/wordml" xmlns:w16du="http://schemas.microsoft.com/office/word/2023/wordml/word16du" xmlns:w16sdtdh="http://schemas.microsoft.com/office/word/2020/wordml/sdtdatahash" xmlns:w16sdtfl="http://schemas.microsoft.com/office/word/2024/wordml/sdtformatlock" xmlns:w16se="http://schemas.microsoft.com/office/word/2015/wordml/symex" xmlns:wpg="http://schemas.microsoft.com/office/word/2010/wordprocessingGroup" xmlns:wpi="http://schemas.microsoft.com/office/word/2010/wordprocessingInk" xmlns:wne="http://schemas.microsoft.com/office/word/2006/wordml" xmlns:wps="http://schemas.microsoft.com/office/word/2010/wordprocessingShape" mc:Ignorable="w14 w15 w16se w16cid w16 w16cex w16sdtdh w16sdtfl w16du wp14">
   <w:abstractNum w:abstractNumId="0" w15:restartNumberingAfterBreak="0">
     <w:nsid w:val="04A42B75"/>
     <w:multiLevelType w:val="hybridMultilevel"/>
@@ -1647,7 +1475,7 @@
 </file>
 
 <file path=word/styles.xml><?xml version="1.0" encoding="utf-8"?>
-<w:styles xmlns:mc="http://schemas.openxmlformats.org/markup-compatibility/2006" xmlns:r="http://schemas.openxmlformats.org/officeDocument/2006/relationships" xmlns:w="http://schemas.openxmlformats.org/wordprocessingml/2006/main" xmlns:w14="http://schemas.microsoft.com/office/word/2010/wordml" xmlns:w15="http://schemas.microsoft.com/office/word/2012/wordml" xmlns:w16cex="http://schemas.microsoft.com/office/word/2018/wordml/cex" xmlns:w16cid="http://schemas.microsoft.com/office/word/2016/wordml/cid" xmlns:w16="http://schemas.microsoft.com/office/word/2018/wordml" xmlns:w16sdtdh="http://schemas.microsoft.com/office/word/2020/wordml/sdtdatahash" xmlns:w16se="http://schemas.microsoft.com/office/word/2015/wordml/symex" mc:Ignorable="w14 w15 w16se w16cid w16 w16cex w16sdtdh">
+<w:styles xmlns:mc="http://schemas.openxmlformats.org/markup-compatibility/2006" xmlns:r="http://schemas.openxmlformats.org/officeDocument/2006/relationships" xmlns:w="http://schemas.openxmlformats.org/wordprocessingml/2006/main" xmlns:w14="http://schemas.microsoft.com/office/word/2010/wordml" xmlns:w15="http://schemas.microsoft.com/office/word/2012/wordml" xmlns:w16cex="http://schemas.microsoft.com/office/word/2018/wordml/cex" xmlns:w16cid="http://schemas.microsoft.com/office/word/2016/wordml/cid" xmlns:w16="http://schemas.microsoft.com/office/word/2018/wordml" xmlns:w16du="http://schemas.microsoft.com/office/word/2023/wordml/word16du" xmlns:w16sdtdh="http://schemas.microsoft.com/office/word/2020/wordml/sdtdatahash" xmlns:w16sdtfl="http://schemas.microsoft.com/office/word/2024/wordml/sdtformatlock" xmlns:w16se="http://schemas.microsoft.com/office/word/2015/wordml/symex" mc:Ignorable="w14 w15 w16se w16cid w16 w16cex w16sdtdh w16sdtfl w16du">
   <w:docDefaults>
     <w:rPrDefault>
       <w:rPr>
@@ -1655,7 +1483,7 @@
         <w:kern w:val="2"/>
         <w:sz w:val="24"/>
         <w:szCs w:val="24"/>
-        <w:lang w:val="en-BR" w:eastAsia="en-US" w:bidi="ar-SA"/>
+        <w:lang w:eastAsia="en-US" w:bidi="ar-SA"/>
         <w14:ligatures w14:val="standardContextual"/>
       </w:rPr>
     </w:rPrDefault>
@@ -2448,6 +2276,7 @@
         <w:ilvl w:val="1"/>
       </w:numPr>
       <w:spacing w:after="160"/>
+      <w:ind w:leftChars="-1" w:left="-1" w:hangingChars="1" w:hanging="1"/>
     </w:pPr>
     <w:rPr>
       <w:rFonts w:eastAsiaTheme="majorEastAsia" w:cstheme="majorBidi"/>

</xml_diff>